<commit_message>
Update final repository screenshot
</commit_message>
<xml_diff>
--- a/module-1/BrittanySmith Assignment 1.2.docx
+++ b/module-1/BrittanySmith Assignment 1.2.docx
@@ -5,6 +5,11 @@
     <w:p>
       <w:r>
         <w:t>Brittany Smith</w:t>
+      </w:r>
+    </w:p>
+    <w:p>
+      <w:r>
+        <w:t>8/15/2026</w:t>
       </w:r>
     </w:p>
     <w:p>
@@ -112,10 +117,10 @@
         </w:rPr>
         <w:lastRenderedPageBreak/>
         <w:drawing>
-          <wp:inline distT="0" distB="0" distL="0" distR="0" wp14:anchorId="32FBB47D" wp14:editId="4ABD9E75">
+          <wp:inline distT="0" distB="0" distL="0" distR="0" wp14:anchorId="458B7A22" wp14:editId="7A6F31AA">
             <wp:extent cx="7924800" cy="5943600"/>
             <wp:effectExtent l="0" t="0" r="0" b="0"/>
-            <wp:docPr id="1346369322" name="Picture 1"/>
+            <wp:docPr id="75793050" name="Picture 1"/>
             <wp:cNvGraphicFramePr>
               <a:graphicFrameLocks xmlns:a="http://schemas.openxmlformats.org/drawingml/2006/main" noChangeAspect="1"/>
             </wp:cNvGraphicFramePr>
@@ -123,7 +128,7 @@
               <a:graphicData uri="http://schemas.openxmlformats.org/drawingml/2006/picture">
                 <pic:pic xmlns:pic="http://schemas.openxmlformats.org/drawingml/2006/picture">
                   <pic:nvPicPr>
-                    <pic:cNvPr id="1346369322" name="Picture 1346369322"/>
+                    <pic:cNvPr id="75793050" name="Picture 75793050"/>
                     <pic:cNvPicPr/>
                   </pic:nvPicPr>
                   <pic:blipFill>

</xml_diff>